<commit_message>
get departement and formation in word document
</commit_message>
<xml_diff>
--- a/Back/src/main/resources/templates/stage_ete_template.docx
+++ b/Back/src/main/resources/templates/stage_ete_template.docx
@@ -683,15 +683,7 @@
         <w:t xml:space="preserve"> </w:t>
       </w:r>
       <w:r>
-        <w:t>(</w:t>
-      </w:r>
-      <w:proofErr w:type="spellStart"/>
-      <w:r>
-        <w:t>ENICarthage</w:t>
-      </w:r>
-      <w:proofErr w:type="spellEnd"/>
-      <w:r>
-        <w:t>), Représenté par son Directeur : MADAME HOUDA BEN ATTIA SETHOM</w:t>
+        <w:t>(ENICarthage), Représenté par son Directeur : MADAME HOUDA BEN ATTIA SETHOM</w:t>
       </w:r>
     </w:p>
     <w:p>
@@ -961,15 +953,7 @@
         <w:t xml:space="preserve"> </w:t>
       </w:r>
       <w:r>
-        <w:t>${</w:t>
-      </w:r>
-      <w:proofErr w:type="spellStart"/>
-      <w:r>
-        <w:t>prenom</w:t>
-      </w:r>
-      <w:proofErr w:type="spellEnd"/>
-      <w:r>
-        <w:t>}</w:t>
+        <w:t>${prenom}</w:t>
       </w:r>
       <w:r>
         <w:tab/>
@@ -1010,25 +994,6 @@
       <w:r>
         <w:tab/>
         <w:t xml:space="preserve"> </w:t>
-      </w:r>
-    </w:p>
-    <w:p>
-      <w:pPr>
-        <w:pStyle w:val="Corpsdetexte"/>
-        <w:ind w:right="957"/>
-        <w:jc w:val="both"/>
-      </w:pPr>
-      <w:r>
-        <w:t>Formation :</w:t>
-      </w:r>
-      <w:r>
-        <w:rPr>
-          <w:spacing w:val="40"/>
-        </w:rPr>
-        <w:t xml:space="preserve">  </w:t>
-      </w:r>
-      <w:r>
-        <w:t>◻Ingénierie, ◻Mastère</w:t>
       </w:r>
     </w:p>
     <w:p>
@@ -1037,6 +1002,39 @@
         <w:jc w:val="both"/>
       </w:pPr>
       <w:r>
+        <w:t>Formation :</w:t>
+      </w:r>
+      <w:r>
+        <w:t xml:space="preserve"> </w:t>
+      </w:r>
+      <w:r>
+        <w:t xml:space="preserve">${INGENIEUR} </w:t>
+      </w:r>
+      <w:r>
+        <w:t>Ingénierie</w:t>
+      </w:r>
+      <w:r>
+        <w:t xml:space="preserve"> </w:t>
+      </w:r>
+      <w:r>
+        <w:t xml:space="preserve"> </w:t>
+      </w:r>
+      <w:r>
+        <w:t>${MASTER}</w:t>
+      </w:r>
+      <w:r>
+        <w:t>Mastère</w:t>
+      </w:r>
+      <w:r>
+        <w:t xml:space="preserve"> </w:t>
+      </w:r>
+    </w:p>
+    <w:p>
+      <w:pPr>
+        <w:pStyle w:val="Corpsdetexte"/>
+        <w:jc w:val="both"/>
+      </w:pPr>
+      <w:r>
         <w:rPr>
           <w:spacing w:val="-2"/>
         </w:rPr>
@@ -1063,10 +1061,22 @@
         <w:t xml:space="preserve"> </w:t>
       </w:r>
       <w:r>
+        <w:t>${</w:t>
+      </w:r>
+      <w:r>
+        <w:t>INFORMATIQUE</w:t>
+      </w:r>
+      <w:r>
+        <w:t>}</w:t>
+      </w:r>
+      <w:r>
+        <w:t xml:space="preserve"> </w:t>
+      </w:r>
+      <w:r>
         <w:rPr>
           <w:spacing w:val="-2"/>
         </w:rPr>
-        <w:t>◻Génie</w:t>
+        <w:t>Génie</w:t>
       </w:r>
       <w:r>
         <w:rPr>
@@ -1087,14 +1097,29 @@
         <w:t xml:space="preserve"> </w:t>
       </w:r>
       <w:r>
+        <w:t>${</w:t>
+      </w:r>
+      <w:r>
+        <w:t>ELECTRIQUE</w:t>
+      </w:r>
+      <w:r>
+        <w:t>}</w:t>
+      </w:r>
+      <w:r>
+        <w:rPr>
+          <w:spacing w:val="-7"/>
+        </w:rPr>
+        <w:t xml:space="preserve"> </w:t>
+      </w:r>
+      <w:r>
         <w:rPr>
           <w:spacing w:val="-2"/>
         </w:rPr>
-        <w:t>◻</w:t>
-      </w:r>
-      <w:r>
-        <w:rPr>
-          <w:spacing w:val="-7"/>
+        <w:t>Génie</w:t>
+      </w:r>
+      <w:r>
+        <w:rPr>
+          <w:spacing w:val="-8"/>
         </w:rPr>
         <w:t xml:space="preserve"> </w:t>
       </w:r>
@@ -1102,18 +1127,6 @@
         <w:rPr>
           <w:spacing w:val="-2"/>
         </w:rPr>
-        <w:t>Génie</w:t>
-      </w:r>
-      <w:r>
-        <w:rPr>
-          <w:spacing w:val="-8"/>
-        </w:rPr>
-        <w:t xml:space="preserve"> </w:t>
-      </w:r>
-      <w:r>
-        <w:rPr>
-          <w:spacing w:val="-2"/>
-        </w:rPr>
         <w:t>Electrique,</w:t>
       </w:r>
       <w:r>
@@ -1123,10 +1136,13 @@
         <w:t xml:space="preserve"> </w:t>
       </w:r>
       <w:r>
-        <w:rPr>
-          <w:spacing w:val="-2"/>
-        </w:rPr>
-        <w:t>◻</w:t>
+        <w:t>${</w:t>
+      </w:r>
+      <w:r>
+        <w:t>INDUSTRIEL</w:t>
+      </w:r>
+      <w:r>
+        <w:t>}</w:t>
       </w:r>
       <w:r>
         <w:rPr>
@@ -1160,15 +1176,7 @@
         <w:jc w:val="both"/>
       </w:pPr>
       <w:r>
-        <w:t>Filière : ${</w:t>
-      </w:r>
-      <w:proofErr w:type="spellStart"/>
-      <w:r>
-        <w:t>filiere</w:t>
-      </w:r>
-      <w:proofErr w:type="spellEnd"/>
-      <w:r>
-        <w:t>}.</w:t>
+        <w:t>Filière : ${filiere}.</w:t>
       </w:r>
       <w:r>
         <w:rPr>
@@ -1211,15 +1219,7 @@
         <w:t xml:space="preserve"> </w:t>
       </w:r>
       <w:r>
-        <w:t>${</w:t>
-      </w:r>
-      <w:proofErr w:type="spellStart"/>
-      <w:r>
-        <w:t>cin</w:t>
-      </w:r>
-      <w:proofErr w:type="spellEnd"/>
-      <w:r>
-        <w:t>}</w:t>
+        <w:t>${cin}</w:t>
       </w:r>
       <w:r>
         <w:rPr>
@@ -1261,15 +1261,7 @@
         <w:t xml:space="preserve"> </w:t>
       </w:r>
       <w:r>
-        <w:t>${</w:t>
-      </w:r>
-      <w:proofErr w:type="spellStart"/>
-      <w:r>
-        <w:t>telephone</w:t>
-      </w:r>
-      <w:proofErr w:type="spellEnd"/>
-      <w:r>
-        <w:t>}</w:t>
+        <w:t>${telephone}</w:t>
       </w:r>
       <w:r>
         <w:rPr>
@@ -1283,11 +1275,9 @@
         </w:rPr>
         <w:tab/>
       </w:r>
-      <w:proofErr w:type="gramStart"/>
       <w:r>
         <w:t>E-mail:</w:t>
       </w:r>
-      <w:proofErr w:type="gramEnd"/>
       <w:r>
         <w:rPr>
           <w:spacing w:val="-5"/>
@@ -1335,7 +1325,6 @@
       <w:r>
         <w:tab/>
       </w:r>
-      <w:proofErr w:type="gramStart"/>
       <w:r>
         <w:tab/>
       </w:r>
@@ -1348,7 +1337,6 @@
       <w:r>
         <w:t>au</w:t>
       </w:r>
-      <w:proofErr w:type="gramEnd"/>
       <w:r>
         <w:rPr>
           <w:spacing w:val="-7"/>
@@ -1378,15 +1366,7 @@
         <w:t xml:space="preserve">Article 2 - </w:t>
       </w:r>
       <w:r>
-        <w:t>Le stage d’été à caractère professionnel et obligatoire, est en rapport avec la spécialité suivie par le stagiaire à l’</w:t>
-      </w:r>
-      <w:proofErr w:type="spellStart"/>
-      <w:r>
-        <w:t>ENICarthage</w:t>
-      </w:r>
-      <w:proofErr w:type="spellEnd"/>
-      <w:r>
-        <w:t>, et fait partie intégrante de son programme d’études. L’étudiant stagiaire demeure sous statut</w:t>
+        <w:t>Le stage d’été à caractère professionnel et obligatoire, est en rapport avec la spécialité suivie par le stagiaire à l’ENICarthage, et fait partie intégrante de son programme d’études. L’étudiant stagiaire demeure sous statut</w:t>
       </w:r>
       <w:r>
         <w:rPr>
@@ -1699,11 +1679,9 @@
         <w:spacing w:before="1"/>
         <w:ind w:right="364"/>
       </w:pPr>
-      <w:proofErr w:type="gramStart"/>
       <w:r>
         <w:t>l’étudiant</w:t>
       </w:r>
-      <w:proofErr w:type="gramEnd"/>
       <w:r>
         <w:rPr>
           <w:spacing w:val="-2"/>
@@ -1846,23 +1824,7 @@
         <w:t xml:space="preserve"> </w:t>
       </w:r>
       <w:r>
-        <w:t>délais la Direction de l’</w:t>
-      </w:r>
-      <w:proofErr w:type="spellStart"/>
-      <w:r>
-        <w:t>ENICarthage</w:t>
-      </w:r>
-      <w:proofErr w:type="spellEnd"/>
-      <w:r>
-        <w:t>. Dès réception, l’</w:t>
-      </w:r>
-      <w:proofErr w:type="spellStart"/>
-      <w:r>
-        <w:t>ENICarthage</w:t>
-      </w:r>
-      <w:proofErr w:type="spellEnd"/>
-      <w:r>
-        <w:t xml:space="preserve"> établit la déclaration d’accident et l’envoie au service d’assurance maladie compétente.</w:t>
+        <w:t>délais la Direction de l’ENICarthage. Dès réception, l’ENICarthage établit la déclaration d’accident et l’envoie au service d’assurance maladie compétente.</w:t>
       </w:r>
     </w:p>
     <w:p>
@@ -1878,15 +1840,7 @@
         <w:t xml:space="preserve">Article 4 - </w:t>
       </w:r>
       <w:r>
-        <w:t>Le Directeur de l’</w:t>
-      </w:r>
-      <w:proofErr w:type="spellStart"/>
-      <w:r>
-        <w:t>ENICarthage</w:t>
-      </w:r>
-      <w:proofErr w:type="spellEnd"/>
-      <w:r>
-        <w:t xml:space="preserve"> et le représentant de l’établissement d’accueil de l’étudiant stagiaire se tiendront mutuellement informés des difficultés (notamment liées aux manquements de l’étudiant stagiaire désigné) et</w:t>
+        <w:t>Le Directeur de l’ENICarthage et le représentant de l’établissement d’accueil de l’étudiant stagiaire se tiendront mutuellement informés des difficultés (notamment liées aux manquements de l’étudiant stagiaire désigné) et</w:t>
       </w:r>
       <w:r>
         <w:rPr>
@@ -2317,7 +2271,6 @@
               </w:rPr>
               <w:t>A</w:t>
             </w:r>
-            <w:proofErr w:type="gramStart"/>
             <w:r>
               <w:rPr>
                 <w:spacing w:val="-7"/>
@@ -2329,14 +2282,7 @@
               <w:rPr>
                 <w:sz w:val="20"/>
               </w:rPr>
-              <w:t>..</w:t>
-            </w:r>
-            <w:proofErr w:type="gramEnd"/>
-            <w:r>
-              <w:rPr>
-                <w:sz w:val="20"/>
-              </w:rPr>
-              <w:t>…….......,</w:t>
+              <w:t>..…….......,</w:t>
             </w:r>
             <w:r>
               <w:rPr>
@@ -2481,21 +2427,7 @@
               <w:rPr>
                 <w:sz w:val="20"/>
               </w:rPr>
-              <w:t>l’</w:t>
-            </w:r>
-            <w:proofErr w:type="spellStart"/>
-            <w:r>
-              <w:rPr>
-                <w:sz w:val="20"/>
-              </w:rPr>
-              <w:t>ENICarthage</w:t>
-            </w:r>
-            <w:proofErr w:type="spellEnd"/>
-            <w:r>
-              <w:rPr>
-                <w:sz w:val="20"/>
-              </w:rPr>
-              <w:t xml:space="preserve"> (signature et cachet)</w:t>
+              <w:t>l’ENICarthage (signature et cachet)</w:t>
             </w:r>
           </w:p>
         </w:tc>
@@ -3351,6 +3283,7 @@
   <w:style w:type="paragraph" w:styleId="Corpsdetexte">
     <w:name w:val="Body Text"/>
     <w:basedOn w:val="Normal"/>
+    <w:link w:val="CorpsdetexteCar"/>
     <w:uiPriority w:val="1"/>
     <w:qFormat/>
     <w:pPr>
@@ -3409,6 +3342,19 @@
       <w:color w:val="1F497D" w:themeColor="text2"/>
       <w:sz w:val="18"/>
       <w:szCs w:val="18"/>
+    </w:rPr>
+  </w:style>
+  <w:style w:type="character" w:customStyle="1" w:styleId="CorpsdetexteCar">
+    <w:name w:val="Corps de texte Car"/>
+    <w:basedOn w:val="Policepardfaut"/>
+    <w:link w:val="Corpsdetexte"/>
+    <w:uiPriority w:val="1"/>
+    <w:rsid w:val="00513473"/>
+    <w:rPr>
+      <w:rFonts w:ascii="Times New Roman" w:eastAsia="Times New Roman" w:hAnsi="Times New Roman" w:cs="Times New Roman"/>
+      <w:sz w:val="20"/>
+      <w:szCs w:val="20"/>
+      <w:lang w:val="fr-FR"/>
     </w:rPr>
   </w:style>
 </w:styles>

</xml_diff>

<commit_message>
fix logo in word
</commit_message>
<xml_diff>
--- a/Back/src/main/resources/templates/stage_ete_template.docx
+++ b/Back/src/main/resources/templates/stage_ete_template.docx
@@ -6,72 +6,20 @@
       <w:pPr>
         <w:spacing w:before="82"/>
         <w:ind w:left="6777" w:right="13"/>
+        <w:rPr>
+          <w:sz w:val="16"/>
+        </w:rPr>
+      </w:pPr>
+    </w:p>
+    <w:p>
+      <w:pPr>
+        <w:spacing w:before="82"/>
+        <w:ind w:left="6777" w:right="13"/>
         <w:jc w:val="center"/>
         <w:rPr>
           <w:sz w:val="16"/>
         </w:rPr>
       </w:pPr>
-      <w:r>
-        <w:rPr>
-          <w:noProof/>
-          <w:sz w:val="16"/>
-        </w:rPr>
-        <w:drawing>
-          <wp:anchor distT="0" distB="0" distL="114300" distR="114300" simplePos="0" relativeHeight="251657216" behindDoc="0" locked="0" layoutInCell="1" allowOverlap="1" wp14:anchorId="222AB4A9" wp14:editId="344F7363">
-            <wp:simplePos x="0" y="0"/>
-            <wp:positionH relativeFrom="margin">
-              <wp:align>left</wp:align>
-            </wp:positionH>
-            <wp:positionV relativeFrom="margin">
-              <wp:align>top</wp:align>
-            </wp:positionV>
-            <wp:extent cx="2029460" cy="937260"/>
-            <wp:effectExtent l="0" t="0" r="0" b="0"/>
-            <wp:wrapSquare wrapText="bothSides"/>
-            <wp:docPr id="4" name="Image 4"/>
-            <wp:cNvGraphicFramePr>
-              <a:graphicFrameLocks xmlns:a="http://schemas.openxmlformats.org/drawingml/2006/main" noChangeAspect="1"/>
-            </wp:cNvGraphicFramePr>
-            <a:graphic xmlns:a="http://schemas.openxmlformats.org/drawingml/2006/main">
-              <a:graphicData uri="http://schemas.openxmlformats.org/drawingml/2006/picture">
-                <pic:pic xmlns:pic="http://schemas.openxmlformats.org/drawingml/2006/picture">
-                  <pic:nvPicPr>
-                    <pic:cNvPr id="4" name="Image 4"/>
-                    <pic:cNvPicPr/>
-                  </pic:nvPicPr>
-                  <pic:blipFill>
-                    <a:blip r:embed="rId4" cstate="print">
-                      <a:extLst>
-                        <a:ext uri="{28A0092B-C50C-407E-A947-70E740481C1C}">
-                          <a14:useLocalDpi xmlns:a14="http://schemas.microsoft.com/office/drawing/2010/main" val="0"/>
-                        </a:ext>
-                      </a:extLst>
-                    </a:blip>
-                    <a:stretch>
-                      <a:fillRect/>
-                    </a:stretch>
-                  </pic:blipFill>
-                  <pic:spPr>
-                    <a:xfrm>
-                      <a:off x="0" y="0"/>
-                      <a:ext cx="2029460" cy="937260"/>
-                    </a:xfrm>
-                    <a:prstGeom prst="rect">
-                      <a:avLst/>
-                    </a:prstGeom>
-                  </pic:spPr>
-                </pic:pic>
-              </a:graphicData>
-            </a:graphic>
-            <wp14:sizeRelH relativeFrom="margin">
-              <wp14:pctWidth>0</wp14:pctWidth>
-            </wp14:sizeRelH>
-            <wp14:sizeRelV relativeFrom="margin">
-              <wp14:pctHeight>0</wp14:pctHeight>
-            </wp14:sizeRelV>
-          </wp:anchor>
-        </w:drawing>
-      </w:r>
       <w:r>
         <w:rPr>
           <w:sz w:val="16"/>
@@ -442,6 +390,14 @@
       </w:r>
     </w:p>
     <w:p>
+      <w:r>
+        <w:rPr>
+          <w:noProof/>
+        </w:rPr>
+        <w:t>[LOGO_ENICARTHAGE]</w:t>
+      </w:r>
+    </w:p>
+    <w:p>
       <w:pPr>
         <w:pStyle w:val="Corpsdetexte"/>
         <w:spacing w:before="114"/>
@@ -683,7 +639,15 @@
         <w:t xml:space="preserve"> </w:t>
       </w:r>
       <w:r>
-        <w:t>(ENICarthage), Représenté par son Directeur : MADAME HOUDA BEN ATTIA SETHOM</w:t>
+        <w:t>(</w:t>
+      </w:r>
+      <w:proofErr w:type="spellStart"/>
+      <w:r>
+        <w:t>ENICarthage</w:t>
+      </w:r>
+      <w:proofErr w:type="spellEnd"/>
+      <w:r>
+        <w:t>), Représenté par son Directeur : MADAME HOUDA BEN ATTIA SETHOM</w:t>
       </w:r>
     </w:p>
     <w:p>
@@ -953,7 +917,15 @@
         <w:t xml:space="preserve"> </w:t>
       </w:r>
       <w:r>
-        <w:t>${prenom}</w:t>
+        <w:t>${</w:t>
+      </w:r>
+      <w:proofErr w:type="spellStart"/>
+      <w:r>
+        <w:t>prenom</w:t>
+      </w:r>
+      <w:proofErr w:type="spellEnd"/>
+      <w:r>
+        <w:t>}</w:t>
       </w:r>
       <w:r>
         <w:tab/>
@@ -1002,14 +974,12 @@
         <w:jc w:val="both"/>
       </w:pPr>
       <w:r>
-        <w:t>Formation :</w:t>
-      </w:r>
-      <w:r>
-        <w:t xml:space="preserve"> </w:t>
+        <w:t xml:space="preserve">Formation : </w:t>
       </w:r>
       <w:r>
         <w:t xml:space="preserve">${INGENIEUR} </w:t>
       </w:r>
+      <w:proofErr w:type="gramStart"/>
       <w:r>
         <w:t>Ingénierie</w:t>
       </w:r>
@@ -1020,7 +990,11 @@
         <w:t xml:space="preserve"> </w:t>
       </w:r>
       <w:r>
-        <w:t>${MASTER}</w:t>
+        <w:t>$</w:t>
+      </w:r>
+      <w:proofErr w:type="gramEnd"/>
+      <w:r>
+        <w:t>{MASTER}</w:t>
       </w:r>
       <w:r>
         <w:t>Mastère</w:t>
@@ -1176,7 +1150,15 @@
         <w:jc w:val="both"/>
       </w:pPr>
       <w:r>
-        <w:t>Filière : ${filiere}.</w:t>
+        <w:t>Filière : ${</w:t>
+      </w:r>
+      <w:proofErr w:type="spellStart"/>
+      <w:r>
+        <w:t>filiere</w:t>
+      </w:r>
+      <w:proofErr w:type="spellEnd"/>
+      <w:r>
+        <w:t>}.</w:t>
       </w:r>
       <w:r>
         <w:rPr>
@@ -1219,7 +1201,15 @@
         <w:t xml:space="preserve"> </w:t>
       </w:r>
       <w:r>
-        <w:t>${cin}</w:t>
+        <w:t>${</w:t>
+      </w:r>
+      <w:proofErr w:type="spellStart"/>
+      <w:r>
+        <w:t>cin</w:t>
+      </w:r>
+      <w:proofErr w:type="spellEnd"/>
+      <w:r>
+        <w:t>}</w:t>
       </w:r>
       <w:r>
         <w:rPr>
@@ -1261,7 +1251,15 @@
         <w:t xml:space="preserve"> </w:t>
       </w:r>
       <w:r>
-        <w:t>${telephone}</w:t>
+        <w:t>${</w:t>
+      </w:r>
+      <w:proofErr w:type="spellStart"/>
+      <w:r>
+        <w:t>telephone</w:t>
+      </w:r>
+      <w:proofErr w:type="spellEnd"/>
+      <w:r>
+        <w:t>}</w:t>
       </w:r>
       <w:r>
         <w:rPr>
@@ -1275,9 +1273,11 @@
         </w:rPr>
         <w:tab/>
       </w:r>
+      <w:proofErr w:type="gramStart"/>
       <w:r>
         <w:t>E-mail:</w:t>
       </w:r>
+      <w:proofErr w:type="gramEnd"/>
       <w:r>
         <w:rPr>
           <w:spacing w:val="-5"/>
@@ -1325,6 +1325,7 @@
       <w:r>
         <w:tab/>
       </w:r>
+      <w:proofErr w:type="gramStart"/>
       <w:r>
         <w:tab/>
       </w:r>
@@ -1337,6 +1338,7 @@
       <w:r>
         <w:t>au</w:t>
       </w:r>
+      <w:proofErr w:type="gramEnd"/>
       <w:r>
         <w:rPr>
           <w:spacing w:val="-7"/>
@@ -1366,7 +1368,15 @@
         <w:t xml:space="preserve">Article 2 - </w:t>
       </w:r>
       <w:r>
-        <w:t>Le stage d’été à caractère professionnel et obligatoire, est en rapport avec la spécialité suivie par le stagiaire à l’ENICarthage, et fait partie intégrante de son programme d’études. L’étudiant stagiaire demeure sous statut</w:t>
+        <w:t>Le stage d’été à caractère professionnel et obligatoire, est en rapport avec la spécialité suivie par le stagiaire à l’</w:t>
+      </w:r>
+      <w:proofErr w:type="spellStart"/>
+      <w:r>
+        <w:t>ENICarthage</w:t>
+      </w:r>
+      <w:proofErr w:type="spellEnd"/>
+      <w:r>
+        <w:t>, et fait partie intégrante de son programme d’études. L’étudiant stagiaire demeure sous statut</w:t>
       </w:r>
       <w:r>
         <w:rPr>
@@ -1679,9 +1689,11 @@
         <w:spacing w:before="1"/>
         <w:ind w:right="364"/>
       </w:pPr>
+      <w:proofErr w:type="gramStart"/>
       <w:r>
         <w:t>l’étudiant</w:t>
       </w:r>
+      <w:proofErr w:type="gramEnd"/>
       <w:r>
         <w:rPr>
           <w:spacing w:val="-2"/>
@@ -1824,7 +1836,23 @@
         <w:t xml:space="preserve"> </w:t>
       </w:r>
       <w:r>
-        <w:t>délais la Direction de l’ENICarthage. Dès réception, l’ENICarthage établit la déclaration d’accident et l’envoie au service d’assurance maladie compétente.</w:t>
+        <w:t>délais la Direction de l’</w:t>
+      </w:r>
+      <w:proofErr w:type="spellStart"/>
+      <w:r>
+        <w:t>ENICarthage</w:t>
+      </w:r>
+      <w:proofErr w:type="spellEnd"/>
+      <w:r>
+        <w:t>. Dès réception, l’</w:t>
+      </w:r>
+      <w:proofErr w:type="spellStart"/>
+      <w:r>
+        <w:t>ENICarthage</w:t>
+      </w:r>
+      <w:proofErr w:type="spellEnd"/>
+      <w:r>
+        <w:t xml:space="preserve"> établit la déclaration d’accident et l’envoie au service d’assurance maladie compétente.</w:t>
       </w:r>
     </w:p>
     <w:p>
@@ -1840,7 +1868,15 @@
         <w:t xml:space="preserve">Article 4 - </w:t>
       </w:r>
       <w:r>
-        <w:t>Le Directeur de l’ENICarthage et le représentant de l’établissement d’accueil de l’étudiant stagiaire se tiendront mutuellement informés des difficultés (notamment liées aux manquements de l’étudiant stagiaire désigné) et</w:t>
+        <w:t>Le Directeur de l’</w:t>
+      </w:r>
+      <w:proofErr w:type="spellStart"/>
+      <w:r>
+        <w:t>ENICarthage</w:t>
+      </w:r>
+      <w:proofErr w:type="spellEnd"/>
+      <w:r>
+        <w:t xml:space="preserve"> et le représentant de l’établissement d’accueil de l’étudiant stagiaire se tiendront mutuellement informés des difficultés (notamment liées aux manquements de l’étudiant stagiaire désigné) et</w:t>
       </w:r>
       <w:r>
         <w:rPr>
@@ -2271,6 +2307,7 @@
               </w:rPr>
               <w:t>A</w:t>
             </w:r>
+            <w:proofErr w:type="gramStart"/>
             <w:r>
               <w:rPr>
                 <w:spacing w:val="-7"/>
@@ -2282,7 +2319,14 @@
               <w:rPr>
                 <w:sz w:val="20"/>
               </w:rPr>
-              <w:t>..…….......,</w:t>
+              <w:t>..</w:t>
+            </w:r>
+            <w:proofErr w:type="gramEnd"/>
+            <w:r>
+              <w:rPr>
+                <w:sz w:val="20"/>
+              </w:rPr>
+              <w:t>…….......,</w:t>
             </w:r>
             <w:r>
               <w:rPr>
@@ -2427,7 +2471,21 @@
               <w:rPr>
                 <w:sz w:val="20"/>
               </w:rPr>
-              <w:t>l’ENICarthage (signature et cachet)</w:t>
+              <w:t>l’</w:t>
+            </w:r>
+            <w:proofErr w:type="spellStart"/>
+            <w:r>
+              <w:rPr>
+                <w:sz w:val="20"/>
+              </w:rPr>
+              <w:t>ENICarthage</w:t>
+            </w:r>
+            <w:proofErr w:type="spellEnd"/>
+            <w:r>
+              <w:rPr>
+                <w:sz w:val="20"/>
+              </w:rPr>
+              <w:t xml:space="preserve"> (signature et cachet)</w:t>
             </w:r>
           </w:p>
         </w:tc>
@@ -2442,18 +2500,6 @@
     <w:p>
       <w:pPr>
         <w:pStyle w:val="Corpsdetexte"/>
-        <w:ind w:left="0"/>
-      </w:pPr>
-    </w:p>
-    <w:p>
-      <w:pPr>
-        <w:pStyle w:val="Corpsdetexte"/>
-        <w:ind w:left="0"/>
-      </w:pPr>
-    </w:p>
-    <w:p>
-      <w:pPr>
-        <w:pStyle w:val="Corpsdetexte"/>
         <w:spacing w:before="208"/>
         <w:ind w:left="0"/>
       </w:pPr>
@@ -2754,7 +2800,7 @@
         </w:rPr>
         <w:t xml:space="preserve"> </w:t>
       </w:r>
-      <w:hyperlink r:id="rId5">
+      <w:hyperlink r:id="rId4">
         <w:r>
           <w:rPr>
             <w:color w:val="0085A2"/>
@@ -2794,7 +2840,7 @@
         </w:rPr>
         <w:t xml:space="preserve">: </w:t>
       </w:r>
-      <w:hyperlink r:id="rId6">
+      <w:hyperlink r:id="rId5">
         <w:r>
           <w:rPr>
             <w:color w:val="006FC0"/>

</xml_diff>

<commit_message>
fix word and add entrepriseId field in ConventionModel
</commit_message>
<xml_diff>
--- a/Back/src/main/resources/templates/stage_ete_template.docx
+++ b/Back/src/main/resources/templates/stage_ete_template.docx
@@ -10,392 +10,203 @@
           <w:sz w:val="16"/>
         </w:rPr>
       </w:pPr>
+      <w:r>
+        <w:rPr>
+          <w:noProof/>
+          <w:sz w:val="16"/>
+          <w:lang w:eastAsia="fr-FR"/>
+        </w:rPr>
+        <w:pict w14:anchorId="4030E431">
+          <v:shapetype id="_x0000_t202" coordsize="21600,21600" o:spt="202" path="m,l,21600r21600,l21600,xe">
+            <v:stroke joinstyle="miter"/>
+            <v:path gradientshapeok="t" o:connecttype="rect"/>
+          </v:shapetype>
+          <v:shape id="_x0000_s1031" type="#_x0000_t202" style="position:absolute;left:0;text-align:left;margin-left:306.75pt;margin-top:-1.25pt;width:222pt;height:87pt;z-index:251658240" stroked="f">
+            <v:textbox>
+              <w:txbxContent>
+                <w:p>
+                  <w:pPr>
+                    <w:jc w:val="center"/>
+                    <w:rPr>
+                      <w:sz w:val="16"/>
+                      <w:szCs w:val="16"/>
+                    </w:rPr>
+                  </w:pPr>
+                  <w:r>
+                    <w:rPr>
+                      <w:sz w:val="16"/>
+                      <w:szCs w:val="16"/>
+                    </w:rPr>
+                    <w:t>République Tunisienne</w:t>
+                  </w:r>
+                </w:p>
+                <w:p>
+                  <w:pPr>
+                    <w:jc w:val="center"/>
+                    <w:rPr>
+                      <w:sz w:val="16"/>
+                      <w:szCs w:val="16"/>
+                    </w:rPr>
+                  </w:pPr>
+                  <w:r>
+                    <w:rPr>
+                      <w:sz w:val="16"/>
+                      <w:szCs w:val="16"/>
+                    </w:rPr>
+                    <w:t>……..</w:t>
+                  </w:r>
+                  <w:r>
+                    <w:rPr>
+                      <w:sz w:val="16"/>
+                      <w:szCs w:val="16"/>
+                    </w:rPr>
+                    <w:t>¤…….</w:t>
+                  </w:r>
+                  <w:r>
+                    <w:rPr>
+                      <w:sz w:val="16"/>
+                      <w:szCs w:val="16"/>
+                    </w:rPr>
+                    <w:t>.</w:t>
+                  </w:r>
+                </w:p>
+                <w:p>
+                  <w:pPr>
+                    <w:jc w:val="center"/>
+                    <w:rPr>
+                      <w:sz w:val="16"/>
+                      <w:szCs w:val="16"/>
+                    </w:rPr>
+                  </w:pPr>
+                  <w:r>
+                    <w:rPr>
+                      <w:sz w:val="16"/>
+                      <w:szCs w:val="16"/>
+                    </w:rPr>
+                    <w:t>Ministère de l’Enseignement Supérieur et de la Recherche Scientifique</w:t>
+                  </w:r>
+                </w:p>
+                <w:p>
+                  <w:pPr>
+                    <w:jc w:val="center"/>
+                    <w:rPr>
+                      <w:sz w:val="16"/>
+                      <w:szCs w:val="16"/>
+                    </w:rPr>
+                  </w:pPr>
+                  <w:r>
+                    <w:rPr>
+                      <w:sz w:val="16"/>
+                      <w:szCs w:val="16"/>
+                    </w:rPr>
+                    <w:t>……..¤……..</w:t>
+                  </w:r>
+                </w:p>
+                <w:p>
+                  <w:pPr>
+                    <w:jc w:val="center"/>
+                    <w:rPr>
+                      <w:sz w:val="16"/>
+                      <w:szCs w:val="16"/>
+                    </w:rPr>
+                  </w:pPr>
+                  <w:r>
+                    <w:rPr>
+                      <w:sz w:val="16"/>
+                      <w:szCs w:val="16"/>
+                    </w:rPr>
+                    <w:t>Université de Carthage</w:t>
+                  </w:r>
+                </w:p>
+                <w:p>
+                  <w:pPr>
+                    <w:jc w:val="center"/>
+                    <w:rPr>
+                      <w:sz w:val="16"/>
+                      <w:szCs w:val="16"/>
+                    </w:rPr>
+                  </w:pPr>
+                  <w:r>
+                    <w:rPr>
+                      <w:sz w:val="16"/>
+                      <w:szCs w:val="16"/>
+                    </w:rPr>
+                    <w:t>……..¤……..</w:t>
+                  </w:r>
+                </w:p>
+                <w:p>
+                  <w:pPr>
+                    <w:jc w:val="center"/>
+                    <w:rPr>
+                      <w:sz w:val="16"/>
+                      <w:szCs w:val="16"/>
+                    </w:rPr>
+                  </w:pPr>
+                  <w:r>
+                    <w:rPr>
+                      <w:sz w:val="16"/>
+                      <w:szCs w:val="16"/>
+                    </w:rPr>
+                    <w:t>École Nationale d’Ingénieurs de Carthage</w:t>
+                  </w:r>
+                </w:p>
+              </w:txbxContent>
+            </v:textbox>
+          </v:shape>
+        </w:pict>
+      </w:r>
     </w:p>
     <w:p>
       <w:pPr>
-        <w:spacing w:before="82"/>
-        <w:ind w:left="6777" w:right="13"/>
-        <w:jc w:val="center"/>
-        <w:rPr>
-          <w:sz w:val="16"/>
-        </w:rPr>
-      </w:pPr>
-      <w:r>
-        <w:rPr>
-          <w:sz w:val="16"/>
-        </w:rPr>
-        <w:t>République</w:t>
-      </w:r>
-      <w:r>
-        <w:rPr>
-          <w:spacing w:val="-10"/>
-          <w:sz w:val="16"/>
-        </w:rPr>
-        <w:t xml:space="preserve"> </w:t>
-      </w:r>
-      <w:r>
-        <w:rPr>
-          <w:spacing w:val="-2"/>
-          <w:sz w:val="16"/>
-        </w:rPr>
-        <w:t>Tunisienne</w:t>
-      </w:r>
+        <w:spacing w:before="2"/>
+        <w:ind w:right="13"/>
+        <w:rPr>
+          <w:noProof/>
+        </w:rPr>
+      </w:pPr>
     </w:p>
     <w:p>
       <w:pPr>
-        <w:tabs>
-          <w:tab w:val="left" w:pos="8373"/>
-          <w:tab w:val="left" w:pos="8936"/>
-        </w:tabs>
-        <w:spacing w:before="2" w:line="137" w:lineRule="exact"/>
-        <w:ind w:left="7931"/>
-        <w:rPr>
-          <w:sz w:val="12"/>
-        </w:rPr>
-      </w:pPr>
-      <w:r>
-        <w:rPr>
-          <w:sz w:val="12"/>
-          <w:u w:val="dotted"/>
-        </w:rPr>
-        <w:tab/>
-      </w:r>
-      <w:r>
-        <w:rPr>
-          <w:spacing w:val="-10"/>
-          <w:sz w:val="12"/>
-        </w:rPr>
-        <w:t>¤</w:t>
-      </w:r>
-      <w:r>
-        <w:rPr>
-          <w:sz w:val="12"/>
-          <w:u w:val="dotted"/>
-        </w:rPr>
-        <w:tab/>
+        <w:spacing w:before="2"/>
+        <w:ind w:right="13"/>
+        <w:rPr>
+          <w:noProof/>
+        </w:rPr>
+      </w:pPr>
+      <w:r>
+        <w:rPr>
+          <w:noProof/>
+        </w:rPr>
+        <w:t>[LOGO_ENICARTHAGE]</w:t>
       </w:r>
     </w:p>
     <w:p>
       <w:pPr>
-        <w:ind w:left="6774" w:right="13"/>
-        <w:jc w:val="center"/>
-        <w:rPr>
-          <w:sz w:val="16"/>
-        </w:rPr>
-      </w:pPr>
-      <w:r>
-        <w:rPr>
-          <w:sz w:val="16"/>
-        </w:rPr>
-        <w:t>Ministère</w:t>
-      </w:r>
-      <w:r>
-        <w:rPr>
-          <w:spacing w:val="-8"/>
-          <w:sz w:val="16"/>
-        </w:rPr>
-        <w:t xml:space="preserve"> </w:t>
-      </w:r>
-      <w:r>
-        <w:rPr>
-          <w:sz w:val="16"/>
-        </w:rPr>
-        <w:t>de</w:t>
-      </w:r>
-      <w:r>
-        <w:rPr>
-          <w:spacing w:val="-8"/>
-          <w:sz w:val="16"/>
-        </w:rPr>
-        <w:t xml:space="preserve"> </w:t>
-      </w:r>
-      <w:r>
-        <w:rPr>
-          <w:sz w:val="16"/>
-        </w:rPr>
-        <w:t>l’Enseignement</w:t>
-      </w:r>
-      <w:r>
-        <w:rPr>
-          <w:spacing w:val="-5"/>
-          <w:sz w:val="16"/>
-        </w:rPr>
-        <w:t xml:space="preserve"> </w:t>
-      </w:r>
-      <w:r>
-        <w:rPr>
-          <w:sz w:val="16"/>
-        </w:rPr>
-        <w:t>Supérieur</w:t>
-      </w:r>
-      <w:r>
-        <w:rPr>
-          <w:spacing w:val="-7"/>
-          <w:sz w:val="16"/>
-        </w:rPr>
-        <w:t xml:space="preserve"> </w:t>
-      </w:r>
-      <w:r>
-        <w:rPr>
-          <w:sz w:val="16"/>
-        </w:rPr>
-        <w:t>et</w:t>
-      </w:r>
-      <w:r>
-        <w:rPr>
-          <w:spacing w:val="-7"/>
-          <w:sz w:val="16"/>
-        </w:rPr>
-        <w:t xml:space="preserve"> </w:t>
-      </w:r>
-      <w:r>
-        <w:rPr>
-          <w:sz w:val="16"/>
-        </w:rPr>
-        <w:t>de</w:t>
-      </w:r>
-      <w:r>
-        <w:rPr>
-          <w:spacing w:val="-8"/>
-          <w:sz w:val="16"/>
-        </w:rPr>
-        <w:t xml:space="preserve"> </w:t>
-      </w:r>
-      <w:r>
-        <w:rPr>
-          <w:sz w:val="16"/>
-        </w:rPr>
-        <w:t>la</w:t>
-      </w:r>
-      <w:r>
-        <w:rPr>
-          <w:spacing w:val="40"/>
-          <w:sz w:val="16"/>
-        </w:rPr>
-        <w:t xml:space="preserve"> </w:t>
-      </w:r>
-      <w:r>
-        <w:rPr>
-          <w:sz w:val="16"/>
-        </w:rPr>
-        <w:t>Recherche</w:t>
-      </w:r>
-      <w:r>
-        <w:rPr>
-          <w:spacing w:val="-5"/>
-          <w:sz w:val="16"/>
-        </w:rPr>
-        <w:t xml:space="preserve"> </w:t>
-      </w:r>
-      <w:r>
-        <w:rPr>
-          <w:sz w:val="16"/>
-        </w:rPr>
-        <w:t>Scientifique</w:t>
-      </w:r>
+        <w:spacing w:before="2"/>
+        <w:ind w:right="13"/>
+        <w:rPr>
+          <w:noProof/>
+        </w:rPr>
+      </w:pPr>
     </w:p>
     <w:p>
       <w:pPr>
-        <w:tabs>
-          <w:tab w:val="left" w:pos="8373"/>
-          <w:tab w:val="left" w:pos="8936"/>
-        </w:tabs>
-        <w:ind w:left="7931"/>
-        <w:rPr>
-          <w:sz w:val="12"/>
-        </w:rPr>
-      </w:pPr>
-      <w:r>
-        <w:rPr>
-          <w:sz w:val="12"/>
-          <w:u w:val="dotted"/>
-        </w:rPr>
-        <w:tab/>
-      </w:r>
-      <w:r>
-        <w:rPr>
-          <w:spacing w:val="-10"/>
-          <w:sz w:val="12"/>
-        </w:rPr>
-        <w:t>¤</w:t>
-      </w:r>
-      <w:r>
-        <w:rPr>
-          <w:sz w:val="12"/>
-          <w:u w:val="dotted"/>
-        </w:rPr>
-        <w:tab/>
-      </w:r>
+        <w:spacing w:before="2"/>
+        <w:ind w:right="13"/>
+        <w:rPr>
+          <w:noProof/>
+        </w:rPr>
+      </w:pPr>
     </w:p>
     <w:p>
       <w:pPr>
-        <w:ind w:left="6778" w:right="13"/>
-        <w:jc w:val="center"/>
-        <w:rPr>
-          <w:sz w:val="16"/>
-        </w:rPr>
-      </w:pPr>
-      <w:r>
-        <w:rPr>
-          <w:sz w:val="16"/>
-        </w:rPr>
-        <w:t>Université</w:t>
-      </w:r>
-      <w:r>
-        <w:rPr>
-          <w:spacing w:val="-8"/>
-          <w:sz w:val="16"/>
-        </w:rPr>
-        <w:t xml:space="preserve"> </w:t>
-      </w:r>
-      <w:r>
-        <w:rPr>
-          <w:sz w:val="16"/>
-        </w:rPr>
-        <w:t>de</w:t>
-      </w:r>
-      <w:r>
-        <w:rPr>
-          <w:spacing w:val="-6"/>
-          <w:sz w:val="16"/>
-        </w:rPr>
-        <w:t xml:space="preserve"> </w:t>
-      </w:r>
-      <w:r>
-        <w:rPr>
-          <w:spacing w:val="-2"/>
-          <w:sz w:val="16"/>
-        </w:rPr>
-        <w:t>Carthage</w:t>
-      </w:r>
-    </w:p>
-    <w:p>
-      <w:pPr>
-        <w:tabs>
-          <w:tab w:val="left" w:pos="8373"/>
-          <w:tab w:val="left" w:pos="8936"/>
-        </w:tabs>
-        <w:spacing w:before="1"/>
-        <w:ind w:left="7931"/>
-        <w:rPr>
-          <w:sz w:val="12"/>
-        </w:rPr>
-      </w:pPr>
-      <w:r>
-        <w:rPr>
-          <w:sz w:val="12"/>
-          <w:u w:val="dotted"/>
-        </w:rPr>
-        <w:tab/>
-      </w:r>
-      <w:r>
-        <w:rPr>
-          <w:spacing w:val="-10"/>
-          <w:sz w:val="12"/>
-        </w:rPr>
-        <w:t>¤</w:t>
-      </w:r>
-      <w:r>
-        <w:rPr>
-          <w:sz w:val="12"/>
-          <w:u w:val="dotted"/>
-        </w:rPr>
-        <w:tab/>
-      </w:r>
-    </w:p>
-    <w:p>
-      <w:pPr>
         <w:spacing w:before="2"/>
-        <w:ind w:left="6779" w:right="13"/>
-        <w:jc w:val="center"/>
+        <w:ind w:right="13"/>
         <w:rPr>
           <w:rFonts w:ascii="Calibri" w:hAnsi="Calibri"/>
           <w:sz w:val="16"/>
         </w:rPr>
       </w:pPr>
-      <w:r>
-        <w:rPr>
-          <w:rFonts w:ascii="Calibri" w:hAnsi="Calibri"/>
-          <w:sz w:val="18"/>
-        </w:rPr>
-        <w:t>É</w:t>
-      </w:r>
-      <w:r>
-        <w:rPr>
-          <w:rFonts w:ascii="Calibri" w:hAnsi="Calibri"/>
-          <w:sz w:val="16"/>
-        </w:rPr>
-        <w:t>cole</w:t>
-      </w:r>
-      <w:r>
-        <w:rPr>
-          <w:rFonts w:ascii="Calibri" w:hAnsi="Calibri"/>
-          <w:spacing w:val="-5"/>
-          <w:sz w:val="16"/>
-        </w:rPr>
-        <w:t xml:space="preserve"> </w:t>
-      </w:r>
-      <w:r>
-        <w:rPr>
-          <w:rFonts w:ascii="Calibri" w:hAnsi="Calibri"/>
-          <w:sz w:val="16"/>
-        </w:rPr>
-        <w:t>Nationale</w:t>
-      </w:r>
-      <w:r>
-        <w:rPr>
-          <w:rFonts w:ascii="Calibri" w:hAnsi="Calibri"/>
-          <w:spacing w:val="-5"/>
-          <w:sz w:val="16"/>
-        </w:rPr>
-        <w:t xml:space="preserve"> </w:t>
-      </w:r>
-      <w:r>
-        <w:rPr>
-          <w:rFonts w:ascii="Calibri" w:hAnsi="Calibri"/>
-          <w:sz w:val="16"/>
-        </w:rPr>
-        <w:t>d’Ingénieurs</w:t>
-      </w:r>
-      <w:r>
-        <w:rPr>
-          <w:rFonts w:ascii="Calibri" w:hAnsi="Calibri"/>
-          <w:spacing w:val="-5"/>
-          <w:sz w:val="16"/>
-        </w:rPr>
-        <w:t xml:space="preserve"> </w:t>
-      </w:r>
-      <w:r>
-        <w:rPr>
-          <w:rFonts w:ascii="Calibri" w:hAnsi="Calibri"/>
-          <w:sz w:val="16"/>
-        </w:rPr>
-        <w:t>de</w:t>
-      </w:r>
-      <w:r>
-        <w:rPr>
-          <w:rFonts w:ascii="Calibri" w:hAnsi="Calibri"/>
-          <w:spacing w:val="-5"/>
-          <w:sz w:val="16"/>
-        </w:rPr>
-        <w:t xml:space="preserve"> </w:t>
-      </w:r>
-      <w:r>
-        <w:rPr>
-          <w:rFonts w:ascii="Calibri" w:hAnsi="Calibri"/>
-          <w:spacing w:val="-2"/>
-          <w:sz w:val="16"/>
-        </w:rPr>
-        <w:t>Carthage</w:t>
-      </w:r>
-    </w:p>
-    <w:p>
-      <w:r>
-        <w:rPr>
-          <w:noProof/>
-        </w:rPr>
-        <w:t>[LOGO_ENICARTHAGE]</w:t>
-      </w:r>
     </w:p>
     <w:p>
       <w:pPr>
@@ -639,15 +450,7 @@
         <w:t xml:space="preserve"> </w:t>
       </w:r>
       <w:r>
-        <w:t>(</w:t>
-      </w:r>
-      <w:proofErr w:type="spellStart"/>
-      <w:r>
-        <w:t>ENICarthage</w:t>
-      </w:r>
-      <w:proofErr w:type="spellEnd"/>
-      <w:r>
-        <w:t>), Représenté par son Directeur : MADAME HOUDA BEN ATTIA SETHOM</w:t>
+        <w:t>(ENICarthage), Représenté par son Directeur : MADAME HOUDA BEN ATTIA SETHOM</w:t>
       </w:r>
     </w:p>
     <w:p>
@@ -917,15 +720,7 @@
         <w:t xml:space="preserve"> </w:t>
       </w:r>
       <w:r>
-        <w:t>${</w:t>
-      </w:r>
-      <w:proofErr w:type="spellStart"/>
-      <w:r>
-        <w:t>prenom</w:t>
-      </w:r>
-      <w:proofErr w:type="spellEnd"/>
-      <w:r>
-        <w:t>}</w:t>
+        <w:t>${prenom}</w:t>
       </w:r>
       <w:r>
         <w:tab/>
@@ -979,7 +774,6 @@
       <w:r>
         <w:t xml:space="preserve">${INGENIEUR} </w:t>
       </w:r>
-      <w:proofErr w:type="gramStart"/>
       <w:r>
         <w:t>Ingénierie</w:t>
       </w:r>
@@ -990,11 +784,7 @@
         <w:t xml:space="preserve"> </w:t>
       </w:r>
       <w:r>
-        <w:t>$</w:t>
-      </w:r>
-      <w:proofErr w:type="gramEnd"/>
-      <w:r>
-        <w:t>{MASTER}</w:t>
+        <w:t>${MASTER}</w:t>
       </w:r>
       <w:r>
         <w:t>Mastère</w:t>
@@ -1150,15 +940,7 @@
         <w:jc w:val="both"/>
       </w:pPr>
       <w:r>
-        <w:t>Filière : ${</w:t>
-      </w:r>
-      <w:proofErr w:type="spellStart"/>
-      <w:r>
-        <w:t>filiere</w:t>
-      </w:r>
-      <w:proofErr w:type="spellEnd"/>
-      <w:r>
-        <w:t>}.</w:t>
+        <w:t>Filière : ${filiere}.</w:t>
       </w:r>
       <w:r>
         <w:rPr>
@@ -1201,15 +983,7 @@
         <w:t xml:space="preserve"> </w:t>
       </w:r>
       <w:r>
-        <w:t>${</w:t>
-      </w:r>
-      <w:proofErr w:type="spellStart"/>
-      <w:r>
-        <w:t>cin</w:t>
-      </w:r>
-      <w:proofErr w:type="spellEnd"/>
-      <w:r>
-        <w:t>}</w:t>
+        <w:t>${cin}</w:t>
       </w:r>
       <w:r>
         <w:rPr>
@@ -1251,15 +1025,7 @@
         <w:t xml:space="preserve"> </w:t>
       </w:r>
       <w:r>
-        <w:t>${</w:t>
-      </w:r>
-      <w:proofErr w:type="spellStart"/>
-      <w:r>
-        <w:t>telephone</w:t>
-      </w:r>
-      <w:proofErr w:type="spellEnd"/>
-      <w:r>
-        <w:t>}</w:t>
+        <w:t>${telephone}</w:t>
       </w:r>
       <w:r>
         <w:rPr>
@@ -1273,11 +1039,9 @@
         </w:rPr>
         <w:tab/>
       </w:r>
-      <w:proofErr w:type="gramStart"/>
       <w:r>
         <w:t>E-mail:</w:t>
       </w:r>
-      <w:proofErr w:type="gramEnd"/>
       <w:r>
         <w:rPr>
           <w:spacing w:val="-5"/>
@@ -1325,7 +1089,6 @@
       <w:r>
         <w:tab/>
       </w:r>
-      <w:proofErr w:type="gramStart"/>
       <w:r>
         <w:tab/>
       </w:r>
@@ -1338,7 +1101,6 @@
       <w:r>
         <w:t>au</w:t>
       </w:r>
-      <w:proofErr w:type="gramEnd"/>
       <w:r>
         <w:rPr>
           <w:spacing w:val="-7"/>
@@ -1368,15 +1130,7 @@
         <w:t xml:space="preserve">Article 2 - </w:t>
       </w:r>
       <w:r>
-        <w:t>Le stage d’été à caractère professionnel et obligatoire, est en rapport avec la spécialité suivie par le stagiaire à l’</w:t>
-      </w:r>
-      <w:proofErr w:type="spellStart"/>
-      <w:r>
-        <w:t>ENICarthage</w:t>
-      </w:r>
-      <w:proofErr w:type="spellEnd"/>
-      <w:r>
-        <w:t>, et fait partie intégrante de son programme d’études. L’étudiant stagiaire demeure sous statut</w:t>
+        <w:t>Le stage d’été à caractère professionnel et obligatoire, est en rapport avec la spécialité suivie par le stagiaire à l’ENICarthage, et fait partie intégrante de son programme d’études. L’étudiant stagiaire demeure sous statut</w:t>
       </w:r>
       <w:r>
         <w:rPr>
@@ -1689,11 +1443,9 @@
         <w:spacing w:before="1"/>
         <w:ind w:right="364"/>
       </w:pPr>
-      <w:proofErr w:type="gramStart"/>
       <w:r>
         <w:t>l’étudiant</w:t>
       </w:r>
-      <w:proofErr w:type="gramEnd"/>
       <w:r>
         <w:rPr>
           <w:spacing w:val="-2"/>
@@ -1836,23 +1588,7 @@
         <w:t xml:space="preserve"> </w:t>
       </w:r>
       <w:r>
-        <w:t>délais la Direction de l’</w:t>
-      </w:r>
-      <w:proofErr w:type="spellStart"/>
-      <w:r>
-        <w:t>ENICarthage</w:t>
-      </w:r>
-      <w:proofErr w:type="spellEnd"/>
-      <w:r>
-        <w:t>. Dès réception, l’</w:t>
-      </w:r>
-      <w:proofErr w:type="spellStart"/>
-      <w:r>
-        <w:t>ENICarthage</w:t>
-      </w:r>
-      <w:proofErr w:type="spellEnd"/>
-      <w:r>
-        <w:t xml:space="preserve"> établit la déclaration d’accident et l’envoie au service d’assurance maladie compétente.</w:t>
+        <w:t>délais la Direction de l’ENICarthage. Dès réception, l’ENICarthage établit la déclaration d’accident et l’envoie au service d’assurance maladie compétente.</w:t>
       </w:r>
     </w:p>
     <w:p>
@@ -1868,15 +1604,7 @@
         <w:t xml:space="preserve">Article 4 - </w:t>
       </w:r>
       <w:r>
-        <w:t>Le Directeur de l’</w:t>
-      </w:r>
-      <w:proofErr w:type="spellStart"/>
-      <w:r>
-        <w:t>ENICarthage</w:t>
-      </w:r>
-      <w:proofErr w:type="spellEnd"/>
-      <w:r>
-        <w:t xml:space="preserve"> et le représentant de l’établissement d’accueil de l’étudiant stagiaire se tiendront mutuellement informés des difficultés (notamment liées aux manquements de l’étudiant stagiaire désigné) et</w:t>
+        <w:t>Le Directeur de l’ENICarthage et le représentant de l’établissement d’accueil de l’étudiant stagiaire se tiendront mutuellement informés des difficultés (notamment liées aux manquements de l’étudiant stagiaire désigné) et</w:t>
       </w:r>
       <w:r>
         <w:rPr>
@@ -2307,7 +2035,6 @@
               </w:rPr>
               <w:t>A</w:t>
             </w:r>
-            <w:proofErr w:type="gramStart"/>
             <w:r>
               <w:rPr>
                 <w:spacing w:val="-7"/>
@@ -2319,14 +2046,7 @@
               <w:rPr>
                 <w:sz w:val="20"/>
               </w:rPr>
-              <w:t>..</w:t>
-            </w:r>
-            <w:proofErr w:type="gramEnd"/>
-            <w:r>
-              <w:rPr>
-                <w:sz w:val="20"/>
-              </w:rPr>
-              <w:t>…….......,</w:t>
+              <w:t>..…….......,</w:t>
             </w:r>
             <w:r>
               <w:rPr>
@@ -2471,21 +2191,7 @@
               <w:rPr>
                 <w:sz w:val="20"/>
               </w:rPr>
-              <w:t>l’</w:t>
-            </w:r>
-            <w:proofErr w:type="spellStart"/>
-            <w:r>
-              <w:rPr>
-                <w:sz w:val="20"/>
-              </w:rPr>
-              <w:t>ENICarthage</w:t>
-            </w:r>
-            <w:proofErr w:type="spellEnd"/>
-            <w:r>
-              <w:rPr>
-                <w:sz w:val="20"/>
-              </w:rPr>
-              <w:t xml:space="preserve"> (signature et cachet)</w:t>
+              <w:t>l’ENICarthage (signature et cachet)</w:t>
             </w:r>
           </w:p>
         </w:tc>
@@ -3035,7 +2741,7 @@
     <w:lsdException w:name="Table Web 2" w:semiHidden="1" w:unhideWhenUsed="1"/>
     <w:lsdException w:name="Table Web 3" w:semiHidden="1" w:unhideWhenUsed="1"/>
     <w:lsdException w:name="Balloon Text" w:semiHidden="1" w:unhideWhenUsed="1"/>
-    <w:lsdException w:name="Table Grid" w:uiPriority="39"/>
+    <w:lsdException w:name="Table Grid" w:semiHidden="1" w:uiPriority="39" w:unhideWhenUsed="1"/>
     <w:lsdException w:name="Table Theme" w:semiHidden="1" w:unhideWhenUsed="1"/>
     <w:lsdException w:name="Placeholder Text" w:semiHidden="1"/>
     <w:lsdException w:name="No Spacing" w:uiPriority="1" w:qFormat="1"/>
@@ -3261,6 +2967,7 @@
   <w:style w:type="paragraph" w:default="1" w:styleId="Normal">
     <w:name w:val="Normal"/>
     <w:qFormat/>
+    <w:rsid w:val="003B211F"/>
     <w:rPr>
       <w:rFonts w:ascii="Times New Roman" w:eastAsia="Times New Roman" w:hAnsi="Times New Roman" w:cs="Times New Roman"/>
       <w:lang w:val="fr-FR"/>
@@ -3271,6 +2978,7 @@
     <w:basedOn w:val="Normal"/>
     <w:uiPriority w:val="9"/>
     <w:qFormat/>
+    <w:rsid w:val="003B211F"/>
     <w:pPr>
       <w:spacing w:line="228" w:lineRule="exact"/>
       <w:ind w:left="338"/>
@@ -3316,6 +3024,7 @@
     <w:semiHidden/>
     <w:unhideWhenUsed/>
     <w:qFormat/>
+    <w:rsid w:val="003B211F"/>
     <w:tblPr>
       <w:tblInd w:w="0" w:type="dxa"/>
       <w:tblCellMar>
@@ -3332,6 +3041,7 @@
     <w:link w:val="CorpsdetexteCar"/>
     <w:uiPriority w:val="1"/>
     <w:qFormat/>
+    <w:rsid w:val="003B211F"/>
     <w:pPr>
       <w:ind w:left="338"/>
     </w:pPr>
@@ -3345,6 +3055,7 @@
     <w:basedOn w:val="Normal"/>
     <w:uiPriority w:val="10"/>
     <w:qFormat/>
+    <w:rsid w:val="003B211F"/>
     <w:pPr>
       <w:jc w:val="center"/>
     </w:pPr>
@@ -3360,12 +3071,14 @@
     <w:basedOn w:val="Normal"/>
     <w:uiPriority w:val="1"/>
     <w:qFormat/>
+    <w:rsid w:val="003B211F"/>
   </w:style>
   <w:style w:type="paragraph" w:customStyle="1" w:styleId="TableParagraph">
     <w:name w:val="Table Paragraph"/>
     <w:basedOn w:val="Normal"/>
     <w:uiPriority w:val="1"/>
     <w:qFormat/>
+    <w:rsid w:val="003B211F"/>
     <w:pPr>
       <w:spacing w:line="221" w:lineRule="exact"/>
       <w:ind w:left="50"/>
@@ -3400,6 +3113,34 @@
       <w:rFonts w:ascii="Times New Roman" w:eastAsia="Times New Roman" w:hAnsi="Times New Roman" w:cs="Times New Roman"/>
       <w:sz w:val="20"/>
       <w:szCs w:val="20"/>
+      <w:lang w:val="fr-FR"/>
+    </w:rPr>
+  </w:style>
+  <w:style w:type="paragraph" w:styleId="Textedebulles">
+    <w:name w:val="Balloon Text"/>
+    <w:basedOn w:val="Normal"/>
+    <w:link w:val="TextedebullesCar"/>
+    <w:uiPriority w:val="99"/>
+    <w:semiHidden/>
+    <w:unhideWhenUsed/>
+    <w:rsid w:val="00CB11FD"/>
+    <w:rPr>
+      <w:rFonts w:ascii="Tahoma" w:hAnsi="Tahoma" w:cs="Tahoma"/>
+      <w:sz w:val="16"/>
+      <w:szCs w:val="16"/>
+    </w:rPr>
+  </w:style>
+  <w:style w:type="character" w:customStyle="1" w:styleId="TextedebullesCar">
+    <w:name w:val="Texte de bulles Car"/>
+    <w:basedOn w:val="Policepardfaut"/>
+    <w:link w:val="Textedebulles"/>
+    <w:uiPriority w:val="99"/>
+    <w:semiHidden/>
+    <w:rsid w:val="00CB11FD"/>
+    <w:rPr>
+      <w:rFonts w:ascii="Tahoma" w:eastAsia="Times New Roman" w:hAnsi="Tahoma" w:cs="Tahoma"/>
+      <w:sz w:val="16"/>
+      <w:szCs w:val="16"/>
       <w:lang w:val="fr-FR"/>
     </w:rPr>
   </w:style>

</xml_diff>